<commit_message>
py topic list improvement
</commit_message>
<xml_diff>
--- a/p/py-25/py-core/self-docs/python-advance.docx
+++ b/p/py-25/py-core/self-docs/python-advance.docx
@@ -767,21 +767,21 @@
           </mc:Choice>
           <mc:Fallback>
             <w:pict>
-              <v:group id="_x0000_s1026" o:spid="_x0000_s1026" o:spt="203" style="position:absolute;left:0pt;margin-left:-0.1pt;margin-top:14.35pt;height:321.4pt;width:276.25pt;mso-wrap-distance-bottom:0pt;mso-wrap-distance-top:0pt;z-index:251659264;mso-width-relative:page;mso-height-relative:page;" coordsize="3508375,4081780" o:gfxdata="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">
+              <v:group id="_x0000_s1026" o:spid="_x0000_s1026" o:spt="203" style="position:absolute;left:0pt;margin-left:-0.1pt;margin-top:14.35pt;height:321.4pt;width:276.25pt;mso-wrap-distance-bottom:0pt;mso-wrap-distance-top:0pt;z-index:251659264;mso-width-relative:page;mso-height-relative:page;" coordsize="3508375,4081780" o:gfxdata="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">
                 <o:lock v:ext="edit" aspectratio="f"/>
-                <v:shape id="_x0000_s1026" o:spid="_x0000_s1026" o:spt="75" type="#_x0000_t75" style="position:absolute;left:0;top:0;height:1343660;width:3508375;" filled="f" o:preferrelative="t" stroked="f" coordsize="21600,21600" o:gfxdata="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">
+                <v:shape id="_x0000_s1026" o:spid="_x0000_s1026" o:spt="75" type="#_x0000_t75" style="position:absolute;left:0;top:0;height:1343660;width:3508375;" filled="f" o:preferrelative="t" stroked="f" coordsize="21600,21600" o:gfxdata="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">
                   <v:fill on="f" focussize="0,0"/>
                   <v:stroke on="f"/>
                   <v:imagedata r:id="rId12" o:title=""/>
                   <o:lock v:ext="edit" aspectratio="t"/>
                 </v:shape>
-                <v:shape id="_x0000_s1026" o:spid="_x0000_s1026" o:spt="75" type="#_x0000_t75" style="position:absolute;left:0;top:1411357;height:461010;width:3508375;" filled="f" o:preferrelative="t" stroked="f" coordsize="21600,21600" o:gfxdata="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">
+                <v:shape id="_x0000_s1026" o:spid="_x0000_s1026" o:spt="75" type="#_x0000_t75" style="position:absolute;left:0;top:1411357;height:461010;width:3508375;" filled="f" o:preferrelative="t" stroked="f" coordsize="21600,21600" o:gfxdata="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">
                   <v:fill on="f" focussize="0,0"/>
                   <v:stroke on="f"/>
                   <v:imagedata r:id="rId13" o:title=""/>
                   <o:lock v:ext="edit" aspectratio="t"/>
                 </v:shape>
-                <v:shape id="_x0000_s1026" o:spid="_x0000_s1026" o:spt="75" type="#_x0000_t75" style="position:absolute;left:0;top:1920240;height:2161540;width:3508375;" filled="f" o:preferrelative="t" stroked="f" coordsize="21600,21600" o:gfxdata="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">
+                <v:shape id="_x0000_s1026" o:spid="_x0000_s1026" o:spt="75" type="#_x0000_t75" style="position:absolute;left:0;top:1920240;height:2161540;width:3508375;" filled="f" o:preferrelative="t" stroked="f" coordsize="21600,21600" o:gfxdata="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">
                   <v:fill on="f" focussize="0,0"/>
                   <v:stroke on="f"/>
                   <v:imagedata r:id="rId14" grayscale="t" o:title=""/>
@@ -9279,22 +9279,7 @@
             </w14:solidFill>
           </w14:textFill>
         </w:rPr>
-        <w:t>'q', 'r', 's', 't', 'u', 'v', 'w', 'x', 'y', 2, 1,</w:t>
-      </w:r>
-      <w:r>
-        <w:rPr>
-          <w:rFonts w:cstheme="minorHAnsi"/>
-          <w:b/>
-          <w:bCs/>
-          <w:color w:val="000000" w:themeColor="text1"/>
-          <w:highlight w:val="lightGray"/>
-          <w14:textFill>
-            <w14:solidFill>
-              <w14:schemeClr w14:val="tx1"/>
-            </w14:solidFill>
-          </w14:textFill>
-        </w:rPr>
-        <w:t xml:space="preserve"> 'b', 'c', 'd', 'e', 'f', 'g', 'h', 'i', 'j', 'k', 'l', 'm', 'n', 'o', 'p']</w:t>
+        <w:t>'q', 'r', 's', 't', 'u', 'v', 'w', 'x', 'y', 2, 1, 'b', 'c', 'd', 'e', 'f', 'g', 'h', 'i', 'j', 'k', 'l', 'm', 'n', 'o', 'p']</w:t>
       </w:r>
       <w:r>
         <w:rPr>
@@ -16825,19 +16810,44 @@
         </w:rPr>
         <w:t>evens = [2, 4, 6, 8, 10, 12, 14, 16, 18, 20];</w:t>
       </w:r>
-      <w:bookmarkStart w:id="0" w:name="_GoBack"/>
-      <w:bookmarkEnd w:id="0"/>
-      <w:r>
-        <w:rPr>
-          <w:rFonts w:cstheme="minorHAnsi"/>
-          <w:color w:val="000000" w:themeColor="text1"/>
-          <w14:textFill>
-            <w14:solidFill>
-              <w14:schemeClr w14:val="tx1"/>
-            </w14:solidFill>
-          </w14:textFill>
-        </w:rPr>
-        <w:t>count = 'even =&gt; '</w:t>
+    </w:p>
+    <w:p>
+      <w:pPr>
+        <w:spacing w:after="0"/>
+        <w:rPr>
+          <w:rFonts w:cstheme="minorHAnsi"/>
+          <w:color w:val="000000" w:themeColor="text1"/>
+          <w14:textFill>
+            <w14:solidFill>
+              <w14:schemeClr w14:val="tx1"/>
+            </w14:solidFill>
+          </w14:textFill>
+        </w:rPr>
+      </w:pPr>
+      <w:r>
+        <w:rPr>
+          <w:rFonts w:hint="default" w:cstheme="minorHAnsi"/>
+          <w:color w:val="000000" w:themeColor="text1"/>
+          <w:lang w:val="en-IN"/>
+          <w14:textFill>
+            <w14:solidFill>
+              <w14:schemeClr w14:val="tx1"/>
+            </w14:solidFill>
+          </w14:textFill>
+        </w:rPr>
+        <w:t>c</w:t>
+      </w:r>
+      <w:r>
+        <w:rPr>
+          <w:rFonts w:cstheme="minorHAnsi"/>
+          <w:color w:val="000000" w:themeColor="text1"/>
+          <w14:textFill>
+            <w14:solidFill>
+              <w14:schemeClr w14:val="tx1"/>
+            </w14:solidFill>
+          </w14:textFill>
+        </w:rPr>
+        <w:t>ount = 'even =&gt; '</w:t>
       </w:r>
     </w:p>
     <w:p>
@@ -18237,6 +18247,7 @@
         <w:rPr>
           <w:rFonts w:cstheme="minorHAnsi"/>
           <w:color w:val="000000" w:themeColor="text1"/>
+          <w:highlight w:val="lightGray"/>
           <w14:textFill>
             <w14:solidFill>
               <w14:schemeClr w14:val="tx1"/>
@@ -18296,6 +18307,24 @@
     </w:p>
     <w:p>
       <w:pPr>
+        <w:pBdr>
+          <w:bottom w:val="single" w:color="auto" w:sz="6" w:space="1"/>
+        </w:pBdr>
+        <w:spacing w:after="0"/>
+        <w:rPr>
+          <w:rFonts w:cstheme="minorHAnsi"/>
+          <w:color w:val="000000" w:themeColor="text1"/>
+          <w:highlight w:val="lightGray"/>
+          <w14:textFill>
+            <w14:solidFill>
+              <w14:schemeClr w14:val="tx1"/>
+            </w14:solidFill>
+          </w14:textFill>
+        </w:rPr>
+      </w:pPr>
+    </w:p>
+    <w:p>
+      <w:pPr>
         <w:spacing w:after="0"/>
         <w:rPr>
           <w:rFonts w:cstheme="minorHAnsi"/>
@@ -20247,7 +20276,34 @@
             </w14:solidFill>
           </w14:textFill>
         </w:rPr>
-        <w:t>// 1,0,25,49</w:t>
+        <w:t>// 1,</w:t>
+      </w:r>
+      <w:r>
+        <w:rPr>
+          <w:rFonts w:hint="default" w:cstheme="minorHAnsi"/>
+          <w:color w:val="000000" w:themeColor="text1"/>
+          <w:highlight w:val="lightGray"/>
+          <w:lang w:val="en-IN"/>
+          <w14:textFill>
+            <w14:solidFill>
+              <w14:schemeClr w14:val="tx1"/>
+            </w14:solidFill>
+          </w14:textFill>
+        </w:rPr>
+        <w:t>9</w:t>
+      </w:r>
+      <w:r>
+        <w:rPr>
+          <w:rFonts w:cstheme="minorHAnsi"/>
+          <w:color w:val="000000" w:themeColor="text1"/>
+          <w:highlight w:val="lightGray"/>
+          <w14:textFill>
+            <w14:solidFill>
+              <w14:schemeClr w14:val="tx1"/>
+            </w14:solidFill>
+          </w14:textFill>
+        </w:rPr>
+        <w:t>,25,49</w:t>
       </w:r>
       <w:r>
         <w:rPr>
@@ -20684,6 +20740,8 @@
           </w14:textFill>
         </w:rPr>
       </w:pPr>
+      <w:bookmarkStart w:id="0" w:name="_GoBack"/>
+      <w:bookmarkEnd w:id="0"/>
     </w:p>
     <w:tbl>
       <w:tblPr>
@@ -20867,7 +20925,6 @@
       </w:tr>
       <w:tr>
         <w:tblPrEx>
-          <w:shd w:val="clear" w:color="auto" w:fill="FFFFFF"/>
           <w:tblCellMar>
             <w:top w:w="0" w:type="dxa"/>
             <w:left w:w="0" w:type="dxa"/>
@@ -36883,7 +36940,7 @@
       <w:fldChar w:fldCharType="separate"/>
     </w:r>
     <w:r>
-      <w:t>07-04-2025</w:t>
+      <w:t>11-04-2025</w:t>
     </w:r>
     <w:r>
       <w:fldChar w:fldCharType="end"/>

</xml_diff>